<commit_message>
Adding silent auto install
</commit_message>
<xml_diff>
--- a/docs/FSTinstall_doc.docx
+++ b/docs/FSTinstall_doc.docx
@@ -1874,7 +1874,7 @@
       </w:pPr>
       <w:r>
         <w:pict w14:anchorId="07BD911E">
-          <v:rect id="_x0000_i1037" style="width:0;height:1.5pt" o:hralign="center" o:hrstd="t" o:hr="t" fillcolor="#a0a0a0" stroked="f"/>
+          <v:rect id="_x0000_i1029" style="width:0;height:1.5pt" o:hralign="center" o:hrstd="t" o:hr="t" fillcolor="#a0a0a0" stroked="f"/>
         </w:pict>
       </w:r>
     </w:p>
@@ -2752,6 +2752,9 @@
         <w:spacing w:after="0"/>
       </w:pPr>
       <w:r>
+        <w:rPr>
+          <w:noProof/>
+        </w:rPr>
         <w:drawing>
           <wp:anchor distT="0" distB="0" distL="114300" distR="114300" simplePos="0" relativeHeight="251660288" behindDoc="0" locked="0" layoutInCell="1" allowOverlap="1" wp14:anchorId="54A86315" wp14:editId="58D2221E">
             <wp:simplePos x="0" y="0"/>
@@ -7928,7 +7931,7 @@
                                   </pic:cNvPicPr>
                                 </pic:nvPicPr>
                                 <pic:blipFill>
-                                  <a:blip r:embed="rId1">
+                                  <a:blip r:embed="rId2">
                                     <a:extLst>
                                       <a:ext uri="{28A0092B-C50C-407E-A947-70E740481C1C}">
                                         <a14:useLocalDpi xmlns:a14="http://schemas.microsoft.com/office/drawing/2010/main" val="0"/>
@@ -14289,6 +14292,7 @@
   <w:style w:type="character" w:default="1" w:styleId="DefaultParagraphFont">
     <w:name w:val="Default Paragraph Font"/>
     <w:uiPriority w:val="1"/>
+    <w:semiHidden/>
     <w:unhideWhenUsed/>
   </w:style>
   <w:style w:type="table" w:default="1" w:styleId="TableNormal">
@@ -15270,6 +15274,23 @@
 </file>
 
 <file path=customXml/item1.xml><?xml version="1.0" encoding="utf-8"?>
+<p:properties xmlns:p="http://schemas.microsoft.com/office/2006/metadata/properties" xmlns:xsi="http://www.w3.org/2001/XMLSchema-instance" xmlns:pc="http://schemas.microsoft.com/office/infopath/2007/PartnerControls">
+  <documentManagement>
+    <_activity xmlns="15d5be7b-41f4-4bfa-88d8-1ef19a2754ab" xsi:nil="true"/>
+  </documentManagement>
+</p:properties>
+</file>
+
+<file path=customXml/item2.xml><?xml version="1.0" encoding="utf-8"?>
+<?mso-contentType ?>
+<FormTemplates xmlns="http://schemas.microsoft.com/sharepoint/v3/contenttype/forms">
+  <Display>DocumentLibraryForm</Display>
+  <Edit>DocumentLibraryForm</Edit>
+  <New>DocumentLibraryForm</New>
+</FormTemplates>
+</file>
+
+<file path=customXml/item3.xml><?xml version="1.0" encoding="utf-8"?>
 <ct:contentTypeSchema xmlns:ct="http://schemas.microsoft.com/office/2006/metadata/contentType" xmlns:ma="http://schemas.microsoft.com/office/2006/metadata/properties/metaAttributes" ct:_="" ma:_="" ma:contentTypeName="Document" ma:contentTypeID="0x010100A4CF6A9F75D7524EA4449E1941BF77F8" ma:contentTypeVersion="15" ma:contentTypeDescription="Create a new document." ma:contentTypeScope="" ma:versionID="7433882fbdbe8e54f057eab419e1a25a">
   <xsd:schema xmlns:xsd="http://www.w3.org/2001/XMLSchema" xmlns:xs="http://www.w3.org/2001/XMLSchema" xmlns:p="http://schemas.microsoft.com/office/2006/metadata/properties" xmlns:ns3="15d5be7b-41f4-4bfa-88d8-1ef19a2754ab" xmlns:ns4="c4110063-ce9b-44d9-9555-1b526630a785" targetNamespace="http://schemas.microsoft.com/office/2006/metadata/properties" ma:root="true" ma:fieldsID="d42d3ccef35b8d75f402a49337e0b4ed" ns3:_="" ns4:_="">
     <xsd:import namespace="15d5be7b-41f4-4bfa-88d8-1ef19a2754ab"/>
@@ -15502,24 +15523,32 @@
 </ct:contentTypeSchema>
 </file>
 
-<file path=customXml/item2.xml><?xml version="1.0" encoding="utf-8"?>
-<?mso-contentType ?>
-<FormTemplates xmlns="http://schemas.microsoft.com/sharepoint/v3/contenttype/forms">
-  <Display>DocumentLibraryForm</Display>
-  <Edit>DocumentLibraryForm</Edit>
-  <New>DocumentLibraryForm</New>
-</FormTemplates>
+<file path=customXml/itemProps1.xml><?xml version="1.0" encoding="utf-8"?>
+<ds:datastoreItem xmlns:ds="http://schemas.openxmlformats.org/officeDocument/2006/customXml" ds:itemID="{AB92FFB7-E44B-47E2-B6A8-0C17740168BE}">
+  <ds:schemaRefs>
+    <ds:schemaRef ds:uri="15d5be7b-41f4-4bfa-88d8-1ef19a2754ab"/>
+    <ds:schemaRef ds:uri="http://purl.org/dc/terms/"/>
+    <ds:schemaRef ds:uri="http://schemas.microsoft.com/office/2006/documentManagement/types"/>
+    <ds:schemaRef ds:uri="http://purl.org/dc/elements/1.1/"/>
+    <ds:schemaRef ds:uri="http://schemas.microsoft.com/office/2006/metadata/properties"/>
+    <ds:schemaRef ds:uri="http://www.w3.org/XML/1998/namespace"/>
+    <ds:schemaRef ds:uri="http://schemas.openxmlformats.org/package/2006/metadata/core-properties"/>
+    <ds:schemaRef ds:uri="http://purl.org/dc/dcmitype/"/>
+    <ds:schemaRef ds:uri="c4110063-ce9b-44d9-9555-1b526630a785"/>
+    <ds:schemaRef ds:uri="http://schemas.microsoft.com/office/infopath/2007/PartnerControls"/>
+  </ds:schemaRefs>
+</ds:datastoreItem>
 </file>
 
-<file path=customXml/item3.xml><?xml version="1.0" encoding="utf-8"?>
-<p:properties xmlns:p="http://schemas.microsoft.com/office/2006/metadata/properties" xmlns:xsi="http://www.w3.org/2001/XMLSchema-instance" xmlns:pc="http://schemas.microsoft.com/office/infopath/2007/PartnerControls">
-  <documentManagement>
-    <_activity xmlns="15d5be7b-41f4-4bfa-88d8-1ef19a2754ab" xsi:nil="true"/>
-  </documentManagement>
-</p:properties>
+<file path=customXml/itemProps2.xml><?xml version="1.0" encoding="utf-8"?>
+<ds:datastoreItem xmlns:ds="http://schemas.openxmlformats.org/officeDocument/2006/customXml" ds:itemID="{99F46FAB-EF5D-4035-8432-BCA82C71FEBB}">
+  <ds:schemaRefs>
+    <ds:schemaRef ds:uri="http://schemas.microsoft.com/sharepoint/v3/contenttype/forms"/>
+  </ds:schemaRefs>
+</ds:datastoreItem>
 </file>
 
-<file path=customXml/itemProps1.xml><?xml version="1.0" encoding="utf-8"?>
+<file path=customXml/itemProps3.xml><?xml version="1.0" encoding="utf-8"?>
 <ds:datastoreItem xmlns:ds="http://schemas.openxmlformats.org/officeDocument/2006/customXml" ds:itemID="{709E90AA-DE9A-4F80-BE34-DA89B1753B33}">
   <ds:schemaRefs>
     <ds:schemaRef ds:uri="http://schemas.microsoft.com/office/2006/metadata/contentType"/>
@@ -15536,29 +15565,4 @@
     <ds:schemaRef ds:uri="http://schemas.microsoft.com/internal/obd"/>
   </ds:schemaRefs>
 </ds:datastoreItem>
-</file>
-
-<file path=customXml/itemProps2.xml><?xml version="1.0" encoding="utf-8"?>
-<ds:datastoreItem xmlns:ds="http://schemas.openxmlformats.org/officeDocument/2006/customXml" ds:itemID="{99F46FAB-EF5D-4035-8432-BCA82C71FEBB}">
-  <ds:schemaRefs>
-    <ds:schemaRef ds:uri="http://schemas.microsoft.com/sharepoint/v3/contenttype/forms"/>
-  </ds:schemaRefs>
-</ds:datastoreItem>
-</file>
-
-<file path=customXml/itemProps3.xml><?xml version="1.0" encoding="utf-8"?>
-<ds:datastoreItem xmlns:ds="http://schemas.openxmlformats.org/officeDocument/2006/customXml" ds:itemID="{AB92FFB7-E44B-47E2-B6A8-0C17740168BE}">
-  <ds:schemaRefs>
-    <ds:schemaRef ds:uri="15d5be7b-41f4-4bfa-88d8-1ef19a2754ab"/>
-    <ds:schemaRef ds:uri="http://purl.org/dc/terms/"/>
-    <ds:schemaRef ds:uri="http://schemas.microsoft.com/office/2006/documentManagement/types"/>
-    <ds:schemaRef ds:uri="http://purl.org/dc/elements/1.1/"/>
-    <ds:schemaRef ds:uri="http://schemas.microsoft.com/office/2006/metadata/properties"/>
-    <ds:schemaRef ds:uri="http://www.w3.org/XML/1998/namespace"/>
-    <ds:schemaRef ds:uri="http://schemas.openxmlformats.org/package/2006/metadata/core-properties"/>
-    <ds:schemaRef ds:uri="http://purl.org/dc/dcmitype/"/>
-    <ds:schemaRef ds:uri="c4110063-ce9b-44d9-9555-1b526630a785"/>
-    <ds:schemaRef ds:uri="http://schemas.microsoft.com/office/infopath/2007/PartnerControls"/>
-  </ds:schemaRefs>
-</ds:datastoreItem>
 </file>
</xml_diff>